<commit_message>
added borders to graphs to make it look neater
</commit_message>
<xml_diff>
--- a/PEX3_Report_Template.docx
+++ b/PEX3_Report_Template.docx
@@ -686,9 +686,9 @@
           <w:noProof/>
         </w:rPr>
         <w:drawing>
-          <wp:inline distT="0" distB="0" distL="0" distR="0" wp14:anchorId="1CDAA3C8" wp14:editId="4FADE234">
+          <wp:inline distT="0" distB="0" distL="0" distR="0" wp14:anchorId="1CDAA3C8" wp14:editId="59386015">
             <wp:extent cx="5486400" cy="4290695"/>
-            <wp:effectExtent l="0" t="0" r="0" b="1905"/>
+            <wp:effectExtent l="25400" t="25400" r="25400" b="27305"/>
             <wp:docPr id="1159530613" name="Picture 1"/>
             <wp:cNvGraphicFramePr>
               <a:graphicFrameLocks xmlns:a="http://schemas.openxmlformats.org/drawingml/2006/main" noChangeAspect="1"/>
@@ -714,6 +714,11 @@
                     <a:prstGeom prst="rect">
                       <a:avLst/>
                     </a:prstGeom>
+                    <a:ln w="25400">
+                      <a:solidFill>
+                        <a:schemeClr val="tx1"/>
+                      </a:solidFill>
+                    </a:ln>
                   </pic:spPr>
                 </pic:pic>
               </a:graphicData>
@@ -737,9 +742,9 @@
           <w:noProof/>
         </w:rPr>
         <w:drawing>
-          <wp:inline distT="0" distB="0" distL="0" distR="0" wp14:anchorId="33BABEF1" wp14:editId="189DC61B">
+          <wp:inline distT="0" distB="0" distL="0" distR="0" wp14:anchorId="33BABEF1" wp14:editId="0E8FEDF3">
             <wp:extent cx="5486400" cy="4290695"/>
-            <wp:effectExtent l="0" t="0" r="0" b="1905"/>
+            <wp:effectExtent l="25400" t="25400" r="25400" b="27305"/>
             <wp:docPr id="2115523366" name="Picture 1"/>
             <wp:cNvGraphicFramePr>
               <a:graphicFrameLocks xmlns:a="http://schemas.openxmlformats.org/drawingml/2006/main" noChangeAspect="1"/>
@@ -765,6 +770,11 @@
                     <a:prstGeom prst="rect">
                       <a:avLst/>
                     </a:prstGeom>
+                    <a:ln w="25400">
+                      <a:solidFill>
+                        <a:schemeClr val="tx1"/>
+                      </a:solidFill>
+                    </a:ln>
                   </pic:spPr>
                 </pic:pic>
               </a:graphicData>
@@ -908,9 +918,9 @@
           <w:noProof/>
         </w:rPr>
         <w:drawing>
-          <wp:inline distT="0" distB="0" distL="0" distR="0" wp14:anchorId="0DE082EC" wp14:editId="102D4939">
+          <wp:inline distT="0" distB="0" distL="0" distR="0" wp14:anchorId="0DE082EC" wp14:editId="57F81900">
             <wp:extent cx="5486400" cy="4283075"/>
-            <wp:effectExtent l="0" t="0" r="0" b="0"/>
+            <wp:effectExtent l="25400" t="25400" r="25400" b="22225"/>
             <wp:docPr id="348250055" name="Picture 1"/>
             <wp:cNvGraphicFramePr>
               <a:graphicFrameLocks xmlns:a="http://schemas.openxmlformats.org/drawingml/2006/main" noChangeAspect="1"/>
@@ -936,6 +946,11 @@
                     <a:prstGeom prst="rect">
                       <a:avLst/>
                     </a:prstGeom>
+                    <a:ln w="25400">
+                      <a:solidFill>
+                        <a:schemeClr val="tx1"/>
+                      </a:solidFill>
+                    </a:ln>
                   </pic:spPr>
                 </pic:pic>
               </a:graphicData>
@@ -959,9 +974,9 @@
           <w:noProof/>
         </w:rPr>
         <w:drawing>
-          <wp:inline distT="0" distB="0" distL="0" distR="0" wp14:anchorId="29A0485C" wp14:editId="755FDA2E">
+          <wp:inline distT="0" distB="0" distL="0" distR="0" wp14:anchorId="29A0485C" wp14:editId="08843CD3">
             <wp:extent cx="5486400" cy="4290695"/>
-            <wp:effectExtent l="0" t="0" r="0" b="1905"/>
+            <wp:effectExtent l="25400" t="25400" r="25400" b="27305"/>
             <wp:docPr id="733880997" name="Picture 1"/>
             <wp:cNvGraphicFramePr>
               <a:graphicFrameLocks xmlns:a="http://schemas.openxmlformats.org/drawingml/2006/main" noChangeAspect="1"/>
@@ -987,6 +1002,11 @@
                     <a:prstGeom prst="rect">
                       <a:avLst/>
                     </a:prstGeom>
+                    <a:ln w="25400">
+                      <a:solidFill>
+                        <a:schemeClr val="tx1"/>
+                      </a:solidFill>
+                    </a:ln>
                   </pic:spPr>
                 </pic:pic>
               </a:graphicData>
@@ -13406,6 +13426,23 @@
 </file>
 
 <file path=customXml/item2.xml><?xml version="1.0" encoding="utf-8"?>
+<p:properties xmlns:p="http://schemas.microsoft.com/office/2006/metadata/properties" xmlns:xsi="http://www.w3.org/2001/XMLSchema-instance" xmlns:pc="http://schemas.microsoft.com/office/infopath/2007/PartnerControls">
+  <documentManagement>
+    <_ip_UnifiedCompliancePolicyUIAction xmlns="http://schemas.microsoft.com/sharepoint/v3" xsi:nil="true"/>
+    <TaxCatchAll xmlns="56f87f42-bac6-49e2-b9d5-04744cb514ee" xsi:nil="true"/>
+    <lcf76f155ced4ddcb4097134ff3c332f xmlns="fcae3b96-bd14-4ee2-8386-a94084e60018">
+      <Terms xmlns="http://schemas.microsoft.com/office/infopath/2007/PartnerControls"/>
+    </lcf76f155ced4ddcb4097134ff3c332f>
+    <_ip_UnifiedCompliancePolicyProperties xmlns="http://schemas.microsoft.com/sharepoint/v3" xsi:nil="true"/>
+  </documentManagement>
+</p:properties>
+</file>
+
+<file path=customXml/item3.xml><?xml version="1.0" encoding="utf-8"?>
+<b:Sources xmlns:b="http://schemas.openxmlformats.org/officeDocument/2006/bibliography" xmlns="http://schemas.openxmlformats.org/officeDocument/2006/bibliography" SelectedStyle="/APA.XSL" StyleName="APA"/>
+</file>
+
+<file path=customXml/item4.xml><?xml version="1.0" encoding="utf-8"?>
 <ct:contentTypeSchema xmlns:ct="http://schemas.microsoft.com/office/2006/metadata/contentType" xmlns:ma="http://schemas.microsoft.com/office/2006/metadata/properties/metaAttributes" ct:_="" ma:_="" ma:contentTypeName="Document" ma:contentTypeID="0x0101006A7D154A9B6B4745A92074A700A40869" ma:contentTypeVersion="24" ma:contentTypeDescription="Create a new document." ma:contentTypeScope="" ma:versionID="49c36a49e684e25092aa685b0fe35842">
   <xsd:schema xmlns:xsd="http://www.w3.org/2001/XMLSchema" xmlns:xs="http://www.w3.org/2001/XMLSchema" xmlns:p="http://schemas.microsoft.com/office/2006/metadata/properties" xmlns:ns1="http://schemas.microsoft.com/sharepoint/v3" xmlns:ns2="fcae3b96-bd14-4ee2-8386-a94084e60018" xmlns:ns3="56f87f42-bac6-49e2-b9d5-04744cb514ee" targetNamespace="http://schemas.microsoft.com/office/2006/metadata/properties" ma:root="true" ma:fieldsID="9c960b9d532a5d3a9032170b89435a2d" ns1:_="" ns2:_="" ns3:_="">
     <xsd:import namespace="http://schemas.microsoft.com/sharepoint/v3"/>
@@ -13683,23 +13720,6 @@
 </ct:contentTypeSchema>
 </file>
 
-<file path=customXml/item3.xml><?xml version="1.0" encoding="utf-8"?>
-<b:Sources xmlns:b="http://schemas.openxmlformats.org/officeDocument/2006/bibliography" xmlns="http://schemas.openxmlformats.org/officeDocument/2006/bibliography" SelectedStyle="/APA.XSL" StyleName="APA"/>
-</file>
-
-<file path=customXml/item4.xml><?xml version="1.0" encoding="utf-8"?>
-<p:properties xmlns:p="http://schemas.microsoft.com/office/2006/metadata/properties" xmlns:xsi="http://www.w3.org/2001/XMLSchema-instance" xmlns:pc="http://schemas.microsoft.com/office/infopath/2007/PartnerControls">
-  <documentManagement>
-    <_ip_UnifiedCompliancePolicyUIAction xmlns="http://schemas.microsoft.com/sharepoint/v3" xsi:nil="true"/>
-    <TaxCatchAll xmlns="56f87f42-bac6-49e2-b9d5-04744cb514ee" xsi:nil="true"/>
-    <lcf76f155ced4ddcb4097134ff3c332f xmlns="fcae3b96-bd14-4ee2-8386-a94084e60018">
-      <Terms xmlns="http://schemas.microsoft.com/office/infopath/2007/PartnerControls"/>
-    </lcf76f155ced4ddcb4097134ff3c332f>
-    <_ip_UnifiedCompliancePolicyProperties xmlns="http://schemas.microsoft.com/sharepoint/v3" xsi:nil="true"/>
-  </documentManagement>
-</p:properties>
-</file>
-
 <file path=customXml/itemProps1.xml><?xml version="1.0" encoding="utf-8"?>
 <ds:datastoreItem xmlns:ds="http://schemas.openxmlformats.org/officeDocument/2006/customXml" ds:itemID="{CEDA4C41-BA4A-4F0B-A87E-F30AA6591D91}">
   <ds:schemaRefs>
@@ -13709,6 +13729,26 @@
 </file>
 
 <file path=customXml/itemProps2.xml><?xml version="1.0" encoding="utf-8"?>
+<ds:datastoreItem xmlns:ds="http://schemas.openxmlformats.org/officeDocument/2006/customXml" ds:itemID="{94EDD69F-103F-4891-A1A7-DE0F9F4E28FD}">
+  <ds:schemaRefs>
+    <ds:schemaRef ds:uri="http://schemas.microsoft.com/office/2006/metadata/properties"/>
+    <ds:schemaRef ds:uri="http://schemas.microsoft.com/office/infopath/2007/PartnerControls"/>
+    <ds:schemaRef ds:uri="http://schemas.microsoft.com/sharepoint/v3"/>
+    <ds:schemaRef ds:uri="56f87f42-bac6-49e2-b9d5-04744cb514ee"/>
+    <ds:schemaRef ds:uri="fcae3b96-bd14-4ee2-8386-a94084e60018"/>
+  </ds:schemaRefs>
+</ds:datastoreItem>
+</file>
+
+<file path=customXml/itemProps3.xml><?xml version="1.0" encoding="utf-8"?>
+<ds:datastoreItem xmlns:ds="http://schemas.openxmlformats.org/officeDocument/2006/customXml" ds:itemID="{EF278816-EC6F-A645-907D-7F25AECB1D4A}">
+  <ds:schemaRefs>
+    <ds:schemaRef ds:uri="http://schemas.openxmlformats.org/officeDocument/2006/bibliography"/>
+  </ds:schemaRefs>
+</ds:datastoreItem>
+</file>
+
+<file path=customXml/itemProps4.xml><?xml version="1.0" encoding="utf-8"?>
 <ds:datastoreItem xmlns:ds="http://schemas.openxmlformats.org/officeDocument/2006/customXml" ds:itemID="{131969F9-69E6-4531-89F9-CCA743737436}">
   <ds:schemaRefs>
     <ds:schemaRef ds:uri="http://schemas.microsoft.com/office/2006/metadata/contentType"/>
@@ -13728,26 +13768,6 @@
 </ds:datastoreItem>
 </file>
 
-<file path=customXml/itemProps3.xml><?xml version="1.0" encoding="utf-8"?>
-<ds:datastoreItem xmlns:ds="http://schemas.openxmlformats.org/officeDocument/2006/customXml" ds:itemID="{EF278816-EC6F-A645-907D-7F25AECB1D4A}">
-  <ds:schemaRefs>
-    <ds:schemaRef ds:uri="http://schemas.openxmlformats.org/officeDocument/2006/bibliography"/>
-  </ds:schemaRefs>
-</ds:datastoreItem>
-</file>
-
-<file path=customXml/itemProps4.xml><?xml version="1.0" encoding="utf-8"?>
-<ds:datastoreItem xmlns:ds="http://schemas.openxmlformats.org/officeDocument/2006/customXml" ds:itemID="{94EDD69F-103F-4891-A1A7-DE0F9F4E28FD}">
-  <ds:schemaRefs>
-    <ds:schemaRef ds:uri="http://schemas.microsoft.com/office/2006/metadata/properties"/>
-    <ds:schemaRef ds:uri="http://schemas.microsoft.com/office/infopath/2007/PartnerControls"/>
-    <ds:schemaRef ds:uri="http://schemas.microsoft.com/sharepoint/v3"/>
-    <ds:schemaRef ds:uri="56f87f42-bac6-49e2-b9d5-04744cb514ee"/>
-    <ds:schemaRef ds:uri="fcae3b96-bd14-4ee2-8386-a94084e60018"/>
-  </ds:schemaRefs>
-</ds:datastoreItem>
-</file>
-
 <file path=docMetadata/LabelInfo.xml><?xml version="1.0" encoding="utf-8"?>
 <clbl:labelList xmlns:clbl="http://schemas.microsoft.com/office/2020/mipLabelMetadata">
   <clbl:label id="{7ab80a06-f029-45c0-84d1-7dad19ce3c61}" enabled="0" method="" siteId="{7ab80a06-f029-45c0-84d1-7dad19ce3c61}" removed="1"/>

</xml_diff>